<commit_message>
feat(api): add /metadata endpoint
</commit_message>
<xml_diff>
--- a/docs/rapport_technique_puls_events.docx
+++ b/docs/rapport_technique_puls_events.docx
@@ -136,16 +136,7 @@
         <w:jc w:val="center"/>
       </w:pPr>
       <w:r>
-        <w:t xml:space="preserve">Projet 7 </w:t>
-      </w:r>
-      <w:r>
-        <w:t>—</w:t>
-      </w:r>
-      <w:r>
-        <w:t xml:space="preserve"> </w:t>
-      </w:r>
-      <w:r>
-        <w:t>Formation Ingénieur IA — OpenClassrooms</w:t>
+        <w:t>Projet 7 — Formation Ingénieur IA — OpenClassrooms</w:t>
       </w:r>
     </w:p>
     <w:p>
@@ -163,6 +154,12 @@
     </w:p>
     <w:sdt>
       <w:sdtPr>
+        <w:rPr>
+          <w:rFonts w:ascii="Arial" w:eastAsia="Arial" w:hAnsi="Arial" w:cs="Arial"/>
+          <w:color w:val="auto"/>
+          <w:sz w:val="22"/>
+          <w:szCs w:val="22"/>
+        </w:rPr>
         <w:id w:val="1018884035"/>
         <w:docPartObj>
           <w:docPartGallery w:val="Table of Contents"/>
@@ -171,12 +168,8 @@
       </w:sdtPr>
       <w:sdtEndPr>
         <w:rPr>
-          <w:rFonts w:ascii="Arial" w:eastAsia="Arial" w:hAnsi="Arial" w:cs="Arial"/>
           <w:b/>
           <w:bCs/>
-          <w:color w:val="auto"/>
-          <w:sz w:val="22"/>
-          <w:szCs w:val="22"/>
         </w:rPr>
       </w:sdtEndPr>
       <w:sdtContent>
@@ -3738,6 +3731,9 @@
     </w:p>
     <w:p>
       <w:r>
+        <w:rPr>
+          <w:noProof/>
+        </w:rPr>
         <w:drawing>
           <wp:inline distT="0" distB="0" distL="0" distR="0" wp14:anchorId="2A2DBA96" wp14:editId="2602A8C5">
             <wp:extent cx="6479540" cy="1635760"/>
@@ -3836,12 +3832,6 @@
         <w:gridCol w:w="7343"/>
       </w:tblGrid>
       <w:tr>
-        <w:tblPrEx>
-          <w:tblCellMar>
-            <w:top w:w="0" w:type="dxa"/>
-            <w:bottom w:w="0" w:type="dxa"/>
-          </w:tblCellMar>
-        </w:tblPrEx>
         <w:trPr>
           <w:trHeight w:val="374"/>
         </w:trPr>
@@ -3917,12 +3907,6 @@
         </w:tc>
       </w:tr>
       <w:tr>
-        <w:tblPrEx>
-          <w:tblCellMar>
-            <w:top w:w="0" w:type="dxa"/>
-            <w:bottom w:w="0" w:type="dxa"/>
-          </w:tblCellMar>
-        </w:tblPrEx>
         <w:trPr>
           <w:trHeight w:val="362"/>
         </w:trPr>
@@ -3977,12 +3961,6 @@
         </w:tc>
       </w:tr>
       <w:tr>
-        <w:tblPrEx>
-          <w:tblCellMar>
-            <w:top w:w="0" w:type="dxa"/>
-            <w:bottom w:w="0" w:type="dxa"/>
-          </w:tblCellMar>
-        </w:tblPrEx>
         <w:trPr>
           <w:trHeight w:val="374"/>
         </w:trPr>
@@ -4040,12 +4018,6 @@
         </w:tc>
       </w:tr>
       <w:tr>
-        <w:tblPrEx>
-          <w:tblCellMar>
-            <w:top w:w="0" w:type="dxa"/>
-            <w:bottom w:w="0" w:type="dxa"/>
-          </w:tblCellMar>
-        </w:tblPrEx>
         <w:trPr>
           <w:trHeight w:val="362"/>
         </w:trPr>
@@ -4111,12 +4083,6 @@
         </w:tc>
       </w:tr>
       <w:tr>
-        <w:tblPrEx>
-          <w:tblCellMar>
-            <w:top w:w="0" w:type="dxa"/>
-            <w:bottom w:w="0" w:type="dxa"/>
-          </w:tblCellMar>
-        </w:tblPrEx>
         <w:trPr>
           <w:trHeight w:val="628"/>
         </w:trPr>
@@ -4181,12 +4147,6 @@
         </w:tc>
       </w:tr>
       <w:tr>
-        <w:tblPrEx>
-          <w:tblCellMar>
-            <w:top w:w="0" w:type="dxa"/>
-            <w:bottom w:w="0" w:type="dxa"/>
-          </w:tblCellMar>
-        </w:tblPrEx>
         <w:trPr>
           <w:trHeight w:val="374"/>
         </w:trPr>
@@ -4246,12 +4206,6 @@
         </w:tc>
       </w:tr>
       <w:tr>
-        <w:tblPrEx>
-          <w:tblCellMar>
-            <w:top w:w="0" w:type="dxa"/>
-            <w:bottom w:w="0" w:type="dxa"/>
-          </w:tblCellMar>
-        </w:tblPrEx>
         <w:trPr>
           <w:trHeight w:val="362"/>
         </w:trPr>
@@ -4301,12 +4255,6 @@
         </w:tc>
       </w:tr>
       <w:tr>
-        <w:tblPrEx>
-          <w:tblCellMar>
-            <w:top w:w="0" w:type="dxa"/>
-            <w:bottom w:w="0" w:type="dxa"/>
-          </w:tblCellMar>
-        </w:tblPrEx>
         <w:trPr>
           <w:trHeight w:val="374"/>
         </w:trPr>
@@ -4364,12 +4312,6 @@
         </w:tc>
       </w:tr>
       <w:tr>
-        <w:tblPrEx>
-          <w:tblCellMar>
-            <w:top w:w="0" w:type="dxa"/>
-            <w:bottom w:w="0" w:type="dxa"/>
-          </w:tblCellMar>
-        </w:tblPrEx>
         <w:trPr>
           <w:trHeight w:val="362"/>
         </w:trPr>
@@ -4419,12 +4361,6 @@
         </w:tc>
       </w:tr>
       <w:tr>
-        <w:tblPrEx>
-          <w:tblCellMar>
-            <w:top w:w="0" w:type="dxa"/>
-            <w:bottom w:w="0" w:type="dxa"/>
-          </w:tblCellMar>
-        </w:tblPrEx>
         <w:trPr>
           <w:trHeight w:val="374"/>
         </w:trPr>
@@ -5960,12 +5896,6 @@
         <w:gridCol w:w="7304"/>
       </w:tblGrid>
       <w:tr>
-        <w:tblPrEx>
-          <w:tblCellMar>
-            <w:top w:w="0" w:type="dxa"/>
-            <w:bottom w:w="0" w:type="dxa"/>
-          </w:tblCellMar>
-        </w:tblPrEx>
         <w:trPr>
           <w:trHeight w:val="175"/>
         </w:trPr>
@@ -6045,12 +5975,6 @@
         </w:tc>
       </w:tr>
       <w:tr>
-        <w:tblPrEx>
-          <w:tblCellMar>
-            <w:top w:w="0" w:type="dxa"/>
-            <w:bottom w:w="0" w:type="dxa"/>
-          </w:tblCellMar>
-        </w:tblPrEx>
         <w:trPr>
           <w:trHeight w:val="360"/>
         </w:trPr>
@@ -6104,12 +6028,6 @@
         </w:tc>
       </w:tr>
       <w:tr>
-        <w:tblPrEx>
-          <w:tblCellMar>
-            <w:top w:w="0" w:type="dxa"/>
-            <w:bottom w:w="0" w:type="dxa"/>
-          </w:tblCellMar>
-        </w:tblPrEx>
         <w:trPr>
           <w:trHeight w:val="233"/>
         </w:trPr>
@@ -6174,12 +6092,6 @@
         </w:tc>
       </w:tr>
       <w:tr>
-        <w:tblPrEx>
-          <w:tblCellMar>
-            <w:top w:w="0" w:type="dxa"/>
-            <w:bottom w:w="0" w:type="dxa"/>
-          </w:tblCellMar>
-        </w:tblPrEx>
         <w:trPr>
           <w:trHeight w:val="360"/>
         </w:trPr>
@@ -6236,12 +6148,6 @@
         </w:tc>
       </w:tr>
       <w:tr>
-        <w:tblPrEx>
-          <w:tblCellMar>
-            <w:top w:w="0" w:type="dxa"/>
-            <w:bottom w:w="0" w:type="dxa"/>
-          </w:tblCellMar>
-        </w:tblPrEx>
         <w:trPr>
           <w:trHeight w:val="372"/>
         </w:trPr>
@@ -6298,12 +6204,6 @@
         </w:tc>
       </w:tr>
       <w:tr>
-        <w:tblPrEx>
-          <w:tblCellMar>
-            <w:top w:w="0" w:type="dxa"/>
-            <w:bottom w:w="0" w:type="dxa"/>
-          </w:tblCellMar>
-        </w:tblPrEx>
         <w:trPr>
           <w:trHeight w:val="360"/>
         </w:trPr>
@@ -6357,12 +6257,6 @@
         </w:tc>
       </w:tr>
       <w:tr>
-        <w:tblPrEx>
-          <w:tblCellMar>
-            <w:top w:w="0" w:type="dxa"/>
-            <w:bottom w:w="0" w:type="dxa"/>
-          </w:tblCellMar>
-        </w:tblPrEx>
         <w:trPr>
           <w:trHeight w:val="372"/>
         </w:trPr>
@@ -6532,12 +6426,6 @@
         <w:gridCol w:w="7483"/>
       </w:tblGrid>
       <w:tr>
-        <w:tblPrEx>
-          <w:tblCellMar>
-            <w:top w:w="0" w:type="dxa"/>
-            <w:bottom w:w="0" w:type="dxa"/>
-          </w:tblCellMar>
-        </w:tblPrEx>
         <w:trPr>
           <w:trHeight w:val="401"/>
         </w:trPr>
@@ -6648,12 +6536,6 @@
         </w:tc>
       </w:tr>
       <w:tr>
-        <w:tblPrEx>
-          <w:tblCellMar>
-            <w:top w:w="0" w:type="dxa"/>
-            <w:bottom w:w="0" w:type="dxa"/>
-          </w:tblCellMar>
-        </w:tblPrEx>
         <w:trPr>
           <w:trHeight w:val="291"/>
         </w:trPr>
@@ -6725,12 +6607,6 @@
         </w:tc>
       </w:tr>
       <w:tr>
-        <w:tblPrEx>
-          <w:tblCellMar>
-            <w:top w:w="0" w:type="dxa"/>
-            <w:bottom w:w="0" w:type="dxa"/>
-          </w:tblCellMar>
-        </w:tblPrEx>
         <w:trPr>
           <w:trHeight w:val="298"/>
         </w:trPr>
@@ -6812,12 +6688,6 @@
         </w:tc>
       </w:tr>
       <w:tr>
-        <w:tblPrEx>
-          <w:tblCellMar>
-            <w:top w:w="0" w:type="dxa"/>
-            <w:bottom w:w="0" w:type="dxa"/>
-          </w:tblCellMar>
-        </w:tblPrEx>
         <w:trPr>
           <w:trHeight w:val="307"/>
         </w:trPr>
@@ -6839,7 +6709,7 @@
           </w:tcPr>
           <w:p>
             <w:r>
-              <w:t>POST</w:t>
+              <w:t>GET</w:t>
             </w:r>
           </w:p>
         </w:tc>
@@ -6865,7 +6735,7 @@
             </w:r>
             <w:proofErr w:type="spellStart"/>
             <w:r>
-              <w:t>ask</w:t>
+              <w:t>metadata</w:t>
             </w:r>
             <w:proofErr w:type="spellEnd"/>
           </w:p>
@@ -6888,26 +6758,96 @@
           </w:tcPr>
           <w:p>
             <w:r>
-              <w:t>Poser une question au système RAG. Body JSON : {"question</w:t>
-            </w:r>
-            <w:proofErr w:type="gramStart"/>
-            <w:r>
-              <w:t>":</w:t>
-            </w:r>
-            <w:proofErr w:type="gramEnd"/>
-            <w:r>
-              <w:t xml:space="preserve"> "..."}</w:t>
+              <w:t>Informations techniques sur l'index et les providers actifs</w:t>
             </w:r>
           </w:p>
         </w:tc>
       </w:tr>
       <w:tr>
-        <w:tblPrEx>
-          <w:tblCellMar>
-            <w:top w:w="0" w:type="dxa"/>
-            <w:bottom w:w="0" w:type="dxa"/>
-          </w:tblCellMar>
-        </w:tblPrEx>
+        <w:trPr>
+          <w:trHeight w:val="307"/>
+        </w:trPr>
+        <w:tc>
+          <w:tcPr>
+            <w:tcW w:w="1145" w:type="dxa"/>
+            <w:tcBorders>
+              <w:top w:val="single" w:sz="1" w:space="0" w:color="CCCCCC"/>
+              <w:left w:val="single" w:sz="1" w:space="0" w:color="CCCCCC"/>
+              <w:bottom w:val="single" w:sz="1" w:space="0" w:color="CCCCCC"/>
+              <w:right w:val="single" w:sz="1" w:space="0" w:color="CCCCCC"/>
+            </w:tcBorders>
+            <w:tcMar>
+              <w:top w:w="80" w:type="dxa"/>
+              <w:left w:w="120" w:type="dxa"/>
+              <w:bottom w:w="80" w:type="dxa"/>
+              <w:right w:w="120" w:type="dxa"/>
+            </w:tcMar>
+          </w:tcPr>
+          <w:p>
+            <w:r>
+              <w:t>POST</w:t>
+            </w:r>
+          </w:p>
+        </w:tc>
+        <w:tc>
+          <w:tcPr>
+            <w:tcW w:w="1548" w:type="dxa"/>
+            <w:tcBorders>
+              <w:top w:val="single" w:sz="1" w:space="0" w:color="CCCCCC"/>
+              <w:left w:val="single" w:sz="1" w:space="0" w:color="CCCCCC"/>
+              <w:bottom w:val="single" w:sz="1" w:space="0" w:color="CCCCCC"/>
+              <w:right w:val="single" w:sz="1" w:space="0" w:color="CCCCCC"/>
+            </w:tcBorders>
+            <w:tcMar>
+              <w:top w:w="80" w:type="dxa"/>
+              <w:left w:w="120" w:type="dxa"/>
+              <w:bottom w:w="80" w:type="dxa"/>
+              <w:right w:w="120" w:type="dxa"/>
+            </w:tcMar>
+          </w:tcPr>
+          <w:p>
+            <w:r>
+              <w:t>/</w:t>
+            </w:r>
+            <w:proofErr w:type="spellStart"/>
+            <w:r>
+              <w:t>ask</w:t>
+            </w:r>
+            <w:proofErr w:type="spellEnd"/>
+          </w:p>
+        </w:tc>
+        <w:tc>
+          <w:tcPr>
+            <w:tcW w:w="7483" w:type="dxa"/>
+            <w:tcBorders>
+              <w:top w:val="single" w:sz="1" w:space="0" w:color="CCCCCC"/>
+              <w:left w:val="single" w:sz="1" w:space="0" w:color="CCCCCC"/>
+              <w:bottom w:val="single" w:sz="1" w:space="0" w:color="CCCCCC"/>
+              <w:right w:val="single" w:sz="1" w:space="0" w:color="CCCCCC"/>
+            </w:tcBorders>
+            <w:tcMar>
+              <w:top w:w="80" w:type="dxa"/>
+              <w:left w:w="120" w:type="dxa"/>
+              <w:bottom w:w="80" w:type="dxa"/>
+              <w:right w:w="120" w:type="dxa"/>
+            </w:tcMar>
+          </w:tcPr>
+          <w:p>
+            <w:r>
+              <w:t>Poser une question au système RAG. Body JSON : {"question</w:t>
+            </w:r>
+            <w:proofErr w:type="gramStart"/>
+            <w:r>
+              <w:t>":</w:t>
+            </w:r>
+            <w:proofErr w:type="gramEnd"/>
+            <w:r>
+              <w:t xml:space="preserve"> "..."}</w:t>
+            </w:r>
+          </w:p>
+        </w:tc>
+      </w:tr>
+      <w:tr>
         <w:trPr>
           <w:trHeight w:val="343"/>
         </w:trPr>
@@ -7073,6 +7013,7 @@
     </w:p>
     <w:p>
       <w:r>
+        <w:lastRenderedPageBreak/>
         <w:t xml:space="preserve">  "sources</w:t>
       </w:r>
       <w:proofErr w:type="gramStart"/>
@@ -7091,7 +7032,6 @@
     </w:p>
     <w:p>
       <w:r>
-        <w:lastRenderedPageBreak/>
         <w:t xml:space="preserve">      "</w:t>
       </w:r>
       <w:proofErr w:type="spellStart"/>
@@ -7391,12 +7331,6 @@
         <w:gridCol w:w="4834"/>
       </w:tblGrid>
       <w:tr>
-        <w:tblPrEx>
-          <w:tblCellMar>
-            <w:top w:w="0" w:type="dxa"/>
-            <w:bottom w:w="0" w:type="dxa"/>
-          </w:tblCellMar>
-        </w:tblPrEx>
         <w:trPr>
           <w:trHeight w:val="390"/>
         </w:trPr>
@@ -7507,12 +7441,6 @@
         </w:tc>
       </w:tr>
       <w:tr>
-        <w:tblPrEx>
-          <w:tblCellMar>
-            <w:top w:w="0" w:type="dxa"/>
-            <w:bottom w:w="0" w:type="dxa"/>
-          </w:tblCellMar>
-        </w:tblPrEx>
         <w:trPr>
           <w:trHeight w:val="379"/>
         </w:trPr>
@@ -7584,12 +7512,6 @@
         </w:tc>
       </w:tr>
       <w:tr>
-        <w:tblPrEx>
-          <w:tblCellMar>
-            <w:top w:w="0" w:type="dxa"/>
-            <w:bottom w:w="0" w:type="dxa"/>
-          </w:tblCellMar>
-        </w:tblPrEx>
         <w:trPr>
           <w:trHeight w:val="390"/>
         </w:trPr>
@@ -7661,12 +7583,6 @@
         </w:tc>
       </w:tr>
       <w:tr>
-        <w:tblPrEx>
-          <w:tblCellMar>
-            <w:top w:w="0" w:type="dxa"/>
-            <w:bottom w:w="0" w:type="dxa"/>
-          </w:tblCellMar>
-        </w:tblPrEx>
         <w:trPr>
           <w:trHeight w:val="377"/>
         </w:trPr>
@@ -7738,12 +7654,6 @@
         </w:tc>
       </w:tr>
       <w:tr>
-        <w:tblPrEx>
-          <w:tblCellMar>
-            <w:top w:w="0" w:type="dxa"/>
-            <w:bottom w:w="0" w:type="dxa"/>
-          </w:tblCellMar>
-        </w:tblPrEx>
         <w:trPr>
           <w:trHeight w:val="390"/>
         </w:trPr>
@@ -7815,12 +7725,6 @@
         </w:tc>
       </w:tr>
       <w:tr>
-        <w:tblPrEx>
-          <w:tblCellMar>
-            <w:top w:w="0" w:type="dxa"/>
-            <w:bottom w:w="0" w:type="dxa"/>
-          </w:tblCellMar>
-        </w:tblPrEx>
         <w:trPr>
           <w:trHeight w:val="311"/>
         </w:trPr>
@@ -7980,12 +7884,6 @@
         <w:gridCol w:w="6962"/>
       </w:tblGrid>
       <w:tr>
-        <w:tblPrEx>
-          <w:tblCellMar>
-            <w:top w:w="0" w:type="dxa"/>
-            <w:bottom w:w="0" w:type="dxa"/>
-          </w:tblCellMar>
-        </w:tblPrEx>
         <w:trPr>
           <w:trHeight w:val="207"/>
         </w:trPr>
@@ -8096,12 +7994,6 @@
         </w:tc>
       </w:tr>
       <w:tr>
-        <w:tblPrEx>
-          <w:tblCellMar>
-            <w:top w:w="0" w:type="dxa"/>
-            <w:bottom w:w="0" w:type="dxa"/>
-          </w:tblCellMar>
-        </w:tblPrEx>
         <w:trPr>
           <w:trHeight w:val="376"/>
         </w:trPr>
@@ -8173,12 +8065,6 @@
         </w:tc>
       </w:tr>
       <w:tr>
-        <w:tblPrEx>
-          <w:tblCellMar>
-            <w:top w:w="0" w:type="dxa"/>
-            <w:bottom w:w="0" w:type="dxa"/>
-          </w:tblCellMar>
-        </w:tblPrEx>
         <w:trPr>
           <w:trHeight w:val="415"/>
         </w:trPr>
@@ -8255,12 +8141,6 @@
         </w:tc>
       </w:tr>
       <w:tr>
-        <w:tblPrEx>
-          <w:tblCellMar>
-            <w:top w:w="0" w:type="dxa"/>
-            <w:bottom w:w="0" w:type="dxa"/>
-          </w:tblCellMar>
-        </w:tblPrEx>
         <w:trPr>
           <w:trHeight w:val="405"/>
         </w:trPr>
@@ -8332,12 +8212,6 @@
         </w:tc>
       </w:tr>
       <w:tr>
-        <w:tblPrEx>
-          <w:tblCellMar>
-            <w:top w:w="0" w:type="dxa"/>
-            <w:bottom w:w="0" w:type="dxa"/>
-          </w:tblCellMar>
-        </w:tblPrEx>
         <w:trPr>
           <w:trHeight w:val="22"/>
         </w:trPr>
@@ -8409,12 +8283,6 @@
         </w:tc>
       </w:tr>
       <w:tr>
-        <w:tblPrEx>
-          <w:tblCellMar>
-            <w:top w:w="0" w:type="dxa"/>
-            <w:bottom w:w="0" w:type="dxa"/>
-          </w:tblCellMar>
-        </w:tblPrEx>
         <w:trPr>
           <w:trHeight w:val="405"/>
         </w:trPr>
@@ -8538,12 +8406,6 @@
         <w:gridCol w:w="6740"/>
       </w:tblGrid>
       <w:tr>
-        <w:tblPrEx>
-          <w:tblCellMar>
-            <w:top w:w="0" w:type="dxa"/>
-            <w:bottom w:w="0" w:type="dxa"/>
-          </w:tblCellMar>
-        </w:tblPrEx>
         <w:trPr>
           <w:trHeight w:val="364"/>
         </w:trPr>
@@ -8654,12 +8516,6 @@
         </w:tc>
       </w:tr>
       <w:tr>
-        <w:tblPrEx>
-          <w:tblCellMar>
-            <w:top w:w="0" w:type="dxa"/>
-            <w:bottom w:w="0" w:type="dxa"/>
-          </w:tblCellMar>
-        </w:tblPrEx>
         <w:trPr>
           <w:trHeight w:val="411"/>
         </w:trPr>
@@ -8733,12 +8589,6 @@
         </w:tc>
       </w:tr>
       <w:tr>
-        <w:tblPrEx>
-          <w:tblCellMar>
-            <w:top w:w="0" w:type="dxa"/>
-            <w:bottom w:w="0" w:type="dxa"/>
-          </w:tblCellMar>
-        </w:tblPrEx>
         <w:trPr>
           <w:trHeight w:val="405"/>
         </w:trPr>
@@ -8820,12 +8670,6 @@
         </w:tc>
       </w:tr>
       <w:tr>
-        <w:tblPrEx>
-          <w:tblCellMar>
-            <w:top w:w="0" w:type="dxa"/>
-            <w:bottom w:w="0" w:type="dxa"/>
-          </w:tblCellMar>
-        </w:tblPrEx>
         <w:trPr>
           <w:trHeight w:val="257"/>
         </w:trPr>
@@ -8907,12 +8751,6 @@
         </w:tc>
       </w:tr>
       <w:tr>
-        <w:tblPrEx>
-          <w:tblCellMar>
-            <w:top w:w="0" w:type="dxa"/>
-            <w:bottom w:w="0" w:type="dxa"/>
-          </w:tblCellMar>
-        </w:tblPrEx>
         <w:trPr>
           <w:trHeight w:val="293"/>
         </w:trPr>
@@ -9577,12 +9415,6 @@
         <w:gridCol w:w="8606"/>
       </w:tblGrid>
       <w:tr>
-        <w:tblPrEx>
-          <w:tblCellMar>
-            <w:top w:w="0" w:type="dxa"/>
-            <w:bottom w:w="0" w:type="dxa"/>
-          </w:tblCellMar>
-        </w:tblPrEx>
         <w:trPr>
           <w:trHeight w:val="371"/>
         </w:trPr>
@@ -9658,12 +9490,6 @@
         </w:tc>
       </w:tr>
       <w:tr>
-        <w:tblPrEx>
-          <w:tblCellMar>
-            <w:top w:w="0" w:type="dxa"/>
-            <w:bottom w:w="0" w:type="dxa"/>
-          </w:tblCellMar>
-        </w:tblPrEx>
         <w:trPr>
           <w:trHeight w:val="411"/>
         </w:trPr>
@@ -9731,12 +9557,6 @@
         </w:tc>
       </w:tr>
       <w:tr>
-        <w:tblPrEx>
-          <w:tblCellMar>
-            <w:top w:w="0" w:type="dxa"/>
-            <w:bottom w:w="0" w:type="dxa"/>
-          </w:tblCellMar>
-        </w:tblPrEx>
         <w:trPr>
           <w:trHeight w:val="371"/>
         </w:trPr>
@@ -9820,12 +9640,6 @@
         </w:tc>
       </w:tr>
       <w:tr>
-        <w:tblPrEx>
-          <w:tblCellMar>
-            <w:top w:w="0" w:type="dxa"/>
-            <w:bottom w:w="0" w:type="dxa"/>
-          </w:tblCellMar>
-        </w:tblPrEx>
         <w:trPr>
           <w:trHeight w:val="304"/>
         </w:trPr>
@@ -9880,12 +9694,6 @@
         </w:tc>
       </w:tr>
       <w:tr>
-        <w:tblPrEx>
-          <w:tblCellMar>
-            <w:top w:w="0" w:type="dxa"/>
-            <w:bottom w:w="0" w:type="dxa"/>
-          </w:tblCellMar>
-        </w:tblPrEx>
         <w:trPr>
           <w:trHeight w:val="371"/>
         </w:trPr>
@@ -9946,12 +9754,6 @@
         </w:tc>
       </w:tr>
       <w:tr>
-        <w:tblPrEx>
-          <w:tblCellMar>
-            <w:top w:w="0" w:type="dxa"/>
-            <w:bottom w:w="0" w:type="dxa"/>
-          </w:tblCellMar>
-        </w:tblPrEx>
         <w:trPr>
           <w:trHeight w:val="363"/>
         </w:trPr>
@@ -10014,12 +9816,6 @@
         </w:tc>
       </w:tr>
       <w:tr>
-        <w:tblPrEx>
-          <w:tblCellMar>
-            <w:top w:w="0" w:type="dxa"/>
-            <w:bottom w:w="0" w:type="dxa"/>
-          </w:tblCellMar>
-        </w:tblPrEx>
         <w:trPr>
           <w:trHeight w:val="359"/>
         </w:trPr>
@@ -10079,12 +9875,6 @@
         </w:tc>
       </w:tr>
       <w:tr>
-        <w:tblPrEx>
-          <w:tblCellMar>
-            <w:top w:w="0" w:type="dxa"/>
-            <w:bottom w:w="0" w:type="dxa"/>
-          </w:tblCellMar>
-        </w:tblPrEx>
         <w:trPr>
           <w:trHeight w:val="371"/>
         </w:trPr>
@@ -10253,12 +10043,6 @@
         <w:gridCol w:w="4181"/>
       </w:tblGrid>
       <w:tr>
-        <w:tblPrEx>
-          <w:tblCellMar>
-            <w:top w:w="0" w:type="dxa"/>
-            <w:bottom w:w="0" w:type="dxa"/>
-          </w:tblCellMar>
-        </w:tblPrEx>
         <w:trPr>
           <w:trHeight w:val="371"/>
         </w:trPr>
@@ -10369,12 +10153,6 @@
         </w:tc>
       </w:tr>
       <w:tr>
-        <w:tblPrEx>
-          <w:tblCellMar>
-            <w:top w:w="0" w:type="dxa"/>
-            <w:bottom w:w="0" w:type="dxa"/>
-          </w:tblCellMar>
-        </w:tblPrEx>
         <w:trPr>
           <w:trHeight w:val="384"/>
         </w:trPr>
@@ -10448,12 +10226,6 @@
         </w:tc>
       </w:tr>
       <w:tr>
-        <w:tblPrEx>
-          <w:tblCellMar>
-            <w:top w:w="0" w:type="dxa"/>
-            <w:bottom w:w="0" w:type="dxa"/>
-          </w:tblCellMar>
-        </w:tblPrEx>
         <w:trPr>
           <w:trHeight w:val="407"/>
         </w:trPr>
@@ -10527,12 +10299,6 @@
         </w:tc>
       </w:tr>
       <w:tr>
-        <w:tblPrEx>
-          <w:tblCellMar>
-            <w:top w:w="0" w:type="dxa"/>
-            <w:bottom w:w="0" w:type="dxa"/>
-          </w:tblCellMar>
-        </w:tblPrEx>
         <w:trPr>
           <w:trHeight w:val="401"/>
         </w:trPr>
@@ -10606,12 +10372,6 @@
         </w:tc>
       </w:tr>
       <w:tr>
-        <w:tblPrEx>
-          <w:tblCellMar>
-            <w:top w:w="0" w:type="dxa"/>
-            <w:bottom w:w="0" w:type="dxa"/>
-          </w:tblCellMar>
-        </w:tblPrEx>
         <w:trPr>
           <w:trHeight w:val="564"/>
         </w:trPr>
@@ -10685,12 +10445,6 @@
         </w:tc>
       </w:tr>
       <w:tr>
-        <w:tblPrEx>
-          <w:tblCellMar>
-            <w:top w:w="0" w:type="dxa"/>
-            <w:bottom w:w="0" w:type="dxa"/>
-          </w:tblCellMar>
-        </w:tblPrEx>
         <w:trPr>
           <w:trHeight w:val="622"/>
         </w:trPr>

</xml_diff>